<commit_message>
Proofcheck Flour Play Swedish: SIGNIFICANT (37 fixes); all 28 audited
Co-Authored-By: Claude Opus 5.5 <noreply@anthropic.com>
Claude-Session: https://claude.ai/code/session_012Cm8JxdqzjuttdUSdkQCUg
</commit_message>
<xml_diff>
--- a/translated/corrected/Flour Play - ASSEMBLED - FORMATTED_Swedish.docx
+++ b/translated/corrected/Flour Play - ASSEMBLED - FORMATTED_Swedish.docx
@@ -155,7 +155,7 @@
     <w:p/>
     <w:p>
       <w:r>
-        <w:t>Snön hade fallit under natten. Inte den tidiga snön i oktober, som försvann igen efter ett par milda dagar. Riktig snö. Den djupsäsongsbetonade sorten som hade börjat vid halloween och skulle ligga kvar till våren. Den låg längs Evergreen Avenue nu i ett gott, rent lagom på femton centimeter som knarrade under fotsulorna när någon kom in och stampade av sig. Över natten hade butikerna börjat byta ut sina skelett och pumpalyktor mot majsstjälkar och papperskalkoner, även om de vanliga pumporna fick stanna kvar på farstutrapporna, dugliga fram till tacksägelsedagen. Avenyn hade blivit tyst efter halloween, i lugnet före den långa, ljusa rusningen mot julen.</w:t>
+        <w:t xml:space="preserve">Snön hade fallit under natten. Inte den tidiga snön i oktober, som försvann igen efter ett par milda dagar. Riktig snö. Den djupsäsongsbetonade sorten som hade börjat vid halloween och skulle ligga kvar till våren. Den låg längs Evergreen Avenue nu i ett gott, rent lager på femton centimeter som knarrade under fotsulorna när någon kom in och stampade av sig. Över natten hade butikerna börjat byta ut sina skelett och pumpalyktor mot majsstjälkar och papperskalkoner, även om de vanliga pumporna fick stanna kvar på farstutrapporna, dugliga fram till tacksägelsedagen. Avenyn hade blivit tyst efter halloween, i lugnet före den långa, ljusa rusningen mot julen.</w:t>
       </w:r>
     </w:p>
     <w:p/>
@@ -269,7 +269,7 @@
     <w:p/>
     <w:p>
       <w:r>
-        <w:t>Det slog mig då, när jag lade de små kvistarna omlott, hur långt jag hade färdats för att sitta där. Inte milen. Det var väldigt många sådana, men jag menade inte milen. Inte för länge sedan hade jag varit nykomlingen i Frost Falls. Kvinnan från Nordpolen med den berömda maken och den egendomliga pingvinen. Folk hade varit snälla mot mig på det sätt en stad är snäll mot en gäst, det vill säga att de beredde plats och höll uppsikt för att se vad jag skulle göra med den. Och nu försökte Olivia stjäla mitt sätt att binda en krans. Marthas hund sov mot min stol lika ledigt som mot hennes. Ingen förklarade någonting för mig längre. Det förutsattes att jag visste. Det hade jag förtjänat snabbt under en hård höst, över en bortsprungen hund och en tidskapsel.</w:t>
+        <w:t xml:space="preserve">Det slog mig då, när jag lade de små kvistarna omlott, hur långt jag hade färdats för att sitta där. Inte milen. Det var väldigt många sådana, men jag menade inte milen. För inte så länge sedan hade jag varit nykomlingen i Frost Falls. Kvinnan från Nordpolen med den berömda maken och den egendomliga pingvinen. Folk hade varit snälla mot mig på det sätt en stad är snäll mot en gäst, det vill säga att de beredde plats och höll uppsikt för att se vad jag skulle göra med den. Och nu försökte Olivia stjäla mitt sätt att binda en krans. Marthas hund sov mot min stol lika ledigt som mot hennes. Ingen förklarade någonting för mig längre. Det förutsattes att jag visste. Det hade jag förtjänat snabbt under en hård höst, över en bortsprungen hund och en tidskapsel.</w:t>
       </w:r>
     </w:p>
     <w:p/>
@@ -353,7 +353,7 @@
     <w:p/>
     <w:p>
       <w:r>
-        <w:t>Vi kastade oss över arbetet på allvar då, åtta kvinnor, en kartong muffins, en pingvin och en sovande hund. Pratet flätades in i och ur arbetet som cirkelprat brukar, en hel morgons små nyheter som rymdes i utrymmena mellan bindandet av kvistar. Ivys dotter hade fått ett nytt jobb i Concord. Claire hade ett reportage på gång på torsdag om plogningsschemat som hon troget lovade oss var mer intressant än det lät. Martha sa att dagarna drar sig ihop så fort nu att Emma kom för att gå ut med Snowball nästan i mörker, och jag sa hälsa barnet så mycket. Martha sa att Emma ständigt frågade efter Pip. Och Pip, som hörde sitt namn och helt riktigt tolkade det som beröm, rufsade till fjädrarna och såg belåten ut.</w:t>
+        <w:t xml:space="preserve">Vi kastade oss över arbetet på allvar då, åtta kvinnor, en kartong muffins, en pingvin och en sovande hund. Pratet flätades in i och ur arbetet som cirkelprat brukar, en hel morgons små nyheter som rymdes i utrymmena mellan bindandet av kvistar. Ivys dotter hade fått ett nytt jobb i Concord. Claire hade ett reportage på gång på torsdag om plogningsschemat som hon troget lovade oss var mer intressant än det lät. Martha sa att dagarna krympte så fort nu att Emma kom för att gå ut med Snowball nästan i mörker, och jag sa hälsa barnet så mycket. Martha sa att Emma ständigt frågade efter Pip. Och Pip, som hörde sitt namn och helt riktigt tolkade det som beröm, rufsade till fjädrarna och såg belåten ut.</w:t>
       </w:r>
     </w:p>
     <w:p/>
@@ -514,7 +514,7 @@
     <w:p/>
     <w:p>
       <w:r>
-        <w:t>Nästa morgon promenerade jag in till stan med Pip vaggande framför mig genom den packade snön, och jag visste att något stod inte rätt till på Holly Jolly innan jag ens nådde dörren. En vanlig morgon kunde man höra Gretas plåtar skramla från halva kvarteret bort. När vinden låg åt rätt håll kunde man känna lukten av hennes första bak långt bort mot kyrkan. Den här morgonen hörde jag bara mina egna kängor knarra i snön. Jag tryckte upp bageridörren och klockan plingade ovanför mitt huvud.</w:t>
+        <w:t xml:space="preserve">Nästa morgon promenerade jag in till stan med Pip vaggande framför mig genom den packade snön, och jag visste att något inte stod rätt till på Holly Jolly innan jag ens nådde dörren. En vanlig morgon kunde man höra Gretas plåtar skramla från halva kvarteret bort. När vinden låg åt rätt håll kunde man känna lukten av hennes första bak långt bort mot kyrkan. Den här morgonen hörde jag bara mina egna kängor knarra i snön. Jag tryckte upp bageridörren och klockan plingade ovanför mitt huvud.</w:t>
       </w:r>
     </w:p>
     <w:p/>
@@ -628,7 +628,7 @@
     <w:p/>
     <w:p>
       <w:r>
-        <w:t>"Allt jag har bakat sedan igår middag. Allt i tunnan. En hel dag under min värsta högsäsong, Jessica. Borta."</w:t>
+        <w:t xml:space="preserve">"Allt jag har bakat sedan igår middag. Allt i tunnan. En hel dag mitt i min mest hektiska säsong, Jessica. Borta."</w:t>
       </w:r>
     </w:p>
     <w:p/>
@@ -849,7 +849,7 @@
     <w:p/>
     <w:p>
       <w:r>
-        <w:t>Det bruna pappret drogs bort från de gamla Fenwick-fönstren samma kväll som kransbindarkretsen träffades. Till morgonen därpå visste alla på gatan att det var ett nytt bageri, Sugarplum Patisserie.</w:t>
+        <w:t xml:space="preserve">Det bruna pappret drogs bort från de gamla Fenwick-fönstren samma kväll som cirkeln band kransar. Till morgonen därpå visste alla på gatan att det var ett nytt bageri, Sugarplum Patisserie.</w:t>
       </w:r>
     </w:p>
     <w:p/>
@@ -1011,7 +1011,7 @@
     <w:p/>
     <w:p>
       <w:r>
-        <w:t>"Hennes dörr har varit stängd hela morgonen, och brödfolket säger att hon har haft en svacka. Degar som misslyckas, den sortens tråkigheter. Jag lider verkligen med henne." Hon skakade på huvudet. "Fast jag ska säga dig att i den här branschen, så fort ett köks namn börjar ifrågasättas," hon tittade på mig, uppriktig och ångerfull, som en yrkesmänniska som anförtror sig åt en vän, "så pratar folk minsann. Det är inte rättvist, men så är det. Ett bageri lever på sitt namn. Släpper man in ett tvivel är det djävulskt svårt att få ut det igen." Hon log. "Men lyssna på mig, som står här och pratar yrke när du bara kommit för att säga hej. Kom in. Jag vill att du ska få se ugnarna."</w:t>
+        <w:t xml:space="preserve">"Hennes dörr har varit stängd hela morgonen, och brödfolket säger att hon har haft en svacka. Degar som misslyckas, den sortens tråkigheter. Jag lider verkligen med henne." Hon skakade på huvudet. "Fast jag ska säga dig att i den här branschen, så fort ett köks namn börjar ifrågasättas," hon tittade på mig, uppriktig och beklagande, som en yrkesmänniska som anförtror sig åt en vän, "så pratar folk minsann. Det är inte rättvist, men så är det. Ett bageri lever på sitt namn. Släpper man in ett tvivel är det djävulskt svårt att få ut det igen." Hon log. "Men lyssna på mig, som står här och pratar yrke när du bara kommit för att säga hej. Kom in. Jag vill att du ska få se ugnarna."</w:t>
       </w:r>
     </w:p>
     <w:p/>
@@ -1053,7 +1053,7 @@
     <w:p/>
     <w:p>
       <w:r>
-        <w:t>"Finjobbet, ja. Alltid. Volymerna har jag leverantörer till. Det finns en grossistfirma från Portland som skickar mig mjöl och smör och kuvertur på pall, bättre än allt man hittar i detaljhandeln, och hälften så billigt i de mängder jag tar." Hon gled över på kuverturen, långsamt, som om jag aldrig i hela mitt liv hade smält choklad. "Det är choklad som är gjord för överdrag. Mer kakaosmör än i de chokladkakor man köper, förstår du, så den flyter tunt och stelnar med ett knäpp."</w:t>
+        <w:t xml:space="preserve">"Finjobbet, ja. Alltid. Volymerna har jag leverantörer till. Det finns en grossistfirma från Portland som skickar mig mjöl och smör och kuvertur på pall, bättre än allt man hittar i detaljhandeln, och till halva priset i de mängder jag tar." Hon gled över på kuverturen, långsamt, som om jag aldrig i hela mitt liv hade smält choklad. "Det är choklad som är gjord för överdrag. Mer kakaosmör än i de chokladkakor man köper, förstår du, så den flyter tunt och stelnar med ett knäpp."</w:t>
       </w:r>
     </w:p>
     <w:p/>
@@ -2512,7 +2512,7 @@
     <w:p/>
     <w:p>
       <w:r>
-        <w:t>"Nå, hur...," sa Hal Thompson och kom ut ur Frosty's i sitt förkläde, men kom inte längre, för det fanns inget hur, och Hal var för ärlig för att låtsas att det fanns det.</w:t>
+        <w:t xml:space="preserve">"Nå, hur…," sa Hal Thompson och kom ut ur Frosty's i sitt förkläde, men kom inte längre, för det fanns inget hur, och Hal var för ärlig för att låtsas att det fanns det.</w:t>
       </w:r>
     </w:p>
     <w:p/>
@@ -3446,7 +3446,7 @@
     </w:p>
     <w:p>
       <w:r>
-        <w:t>Jag satte inget ansikte på det, även om staden skulle ha gjort det. Men marken under frågan hade flyttat på sig medan jag stod på Docs trappa. Det som hade hänt med Gretas bakning fick sin förklaring, i en konservburk i min kappa. Kvar stod frågan om vem på den här gatan som kunde nå det mjölet och kände till den exakta dosen för att förstöra det.</w:t>
+        <w:t xml:space="preserve">Jag satte inget ansikte på det, även om staden skulle ha gjort det. Men marken under frågan hade flyttat på sig medan jag stod på Docs trappa. Det som hade hänt med Gretas bakning fick sin förklaring, i en syltburk i min kappa. Kvar stod frågan om vem på den här gatan som kunde nå det mjölet och kände till den exakta dosen för att förstöra det.</w:t>
       </w:r>
     </w:p>
     <w:p>
@@ -3526,7 +3526,7 @@
     <w:p/>
     <w:p>
       <w:r>
-        <w:t>Det var allt som krävdes. Jag vände på koppen och tyckte inte om hur enkelt det var. Greta var uppe och mjölad vid fyra, båda händerna i en jäsande deg eller en het plåt, ugnen dånande och bakrummet tätt av hetta. Hon slog upp den där dörren mot gränden för luftens skull och barmhärtigheten i ett kallt drag på en bagare som hållit på vid ugnarna sedan det mörknat. Det var bara det vanliga arbetet i en fungerande butik. Men fram till tegelstenen innebar det att en dörr stod öppen mot den gränden under två timmar varje mörk morgon. En kvinna på andra sidan om den, händerna fulla av deg, med ryggen mot kylan. Och däremellan en mjöltunna som ingen höll uppsikt över alls.</w:t>
+        <w:t xml:space="preserve">Det var allt som krävdes. Jag vände på koppen och tyckte inte om hur enkelt det var. Greta var uppe och mjölad vid fyra, båda händerna i en jäsande deg eller en het plåt, ugnen dånande och bakrummet tätt av hetta. Hon slog upp den där dörren mot gränden för luftens skull och barmhärtigheten i ett kallt drag på en bagare som hållit på vid ugnarna sedan långt före gryningen. Det var bara det vanliga arbetet i en fungerande butik. Men fram till tegelstenen innebar det att en dörr stod öppen mot den gränden under två timmar varje mörk morgon. En kvinna på andra sidan om den, händerna fulla av deg, med ryggen mot kylan. Och däremellan en mjöltunna som ingen höll uppsikt över alls.</w:t>
       </w:r>
     </w:p>
     <w:p/>
@@ -3574,7 +3574,7 @@
     <w:p/>
     <w:p>
       <w:r>
-        <w:t>"Så," sa jag lågt till Pip. "Inte inlåst. Inte övervakad. Öppen mot luften med ryggen vänd mot den, varje mörk morgon fram till tegelstenen. Vem som helst som hörde hemma i den här gränden före gryningen kunde ha stått precis här."</w:t>
+        <w:t xml:space="preserve">"Så," sa jag lågt till Pip. "Inte inlåst. Inte övervakad. Öppen mot luften medan hon stod med ryggen mot den, varje mörk morgon fram till tegelstenen. Vem som helst som hörde hemma i den här gränden före gryningen kunde ha stått precis här."</w:t>
       </w:r>
     </w:p>
     <w:p/>
@@ -4971,7 +4971,7 @@
     </w:p>
     <w:p>
       <w:r>
-        <w:t>"Åh, Greta." Ett dämpat ljud, halvt ett skratt. Medkänsla på ytan och något svalare under, och det svala var det sannare av de två. "Stackars kvinna. Så bedrövlig tajming, att hennes trubbel drabbar henne den enda månad hon har minst råd med det." Hon lutade höften mot marmorn och lät förtrolig. "Mellan oss sagt är jag inte förvånad. Den byggnaden är hundra år gammal om den är ett dygn, och man kan inte driva ett storkök i en sådan och förvänta sig att länet blundar för evigt. Fogarna ger vika. Tätningslisterna ger vika. Handfatet är kopplat till ett gammalt rör och man ligger två grader under normen och vet inte om det förrän en karl kliver in med en termometer. Det är inte hennes fel, egentligen. Men det är inte heller otur. Det är ett gammalt kök som hinner ikapp henne, i värsta tänkbara stund."</w:t>
+        <w:t xml:space="preserve">"Åh, Greta." Ett dämpat ljud, halvt ett skratt. Medkänsla på ytan och något svalare under, och det svala var det sannare av de två. "Stackars människa. Så bedrövlig tajming, att hennes trubbel drabbar henne den enda månad hon har minst råd med det." Hon lutade höften mot marmorn och lät förtrolig. "Mellan oss sagt är jag inte förvånad. Den byggnaden är hundra år gammal om den är ett dygn, och man kan inte driva ett storkök i en sådan och förvänta sig att länet blundar för evigt. Fogarna ger vika. Tätningslisterna ger vika. Handfatet är kopplat till ett gammalt rör och man ligger två grader under normen och vet inte om det förrän en karl kliver in med en termometer. Det är inte hennes fel, egentligen. Men det är inte heller otur. Det är ett gammalt kök som hinner ikapp henne, i värsta tänkbara stund."</w:t>
       </w:r>
     </w:p>
     <w:p>
@@ -5121,7 +5121,7 @@
     </w:p>
     <w:p>
       <w:r>
-        <w:t>"Jag hade sagt det förut om någon hade frågat mig i stället för att bestämma sig. De är dumma, inte elaka. De hörde hela stan säga att det var något fel på henne, och de klistrade det värsta ordet de kunde komma på på hennes vägg."</w:t>
+        <w:t xml:space="preserve">"Jag hade sagt det förut om någon hade frågat mig i stället för att bestämma sig. De är dumma, inte elaka. De hörde hela stan säga att det var något fel på henne, och de målade det värsta ordet de kunde komma på på hennes vägg."</w:t>
       </w:r>
     </w:p>
     <w:p>
@@ -5226,7 +5226,7 @@
     </w:p>
     <w:p>
       <w:r>
-        <w:t>Doc Mitchell satt vid sin bänk med en bondesäck med havre öppen framför sig och ett förstoringsglas i handen. Han såg upp när jag kom in, och tittade sedan på konservburken som jag ställde ned bredvid havren.</w:t>
+        <w:t xml:space="preserve">Doc Mitchell satt vid sin bänk med en bondesäck med havre öppen framför sig och ett förstoringsglas i handen. Han såg upp när jag kom in, och tittade sedan på syltburken som jag ställde ned bredvid havren.</w:t>
       </w:r>
     </w:p>
     <w:p>
@@ -5536,7 +5536,7 @@
     </w:p>
     <w:p>
       <w:r>
-        <w:t>Vid krigsmonumentet sprang Pip i förväg till den tilltrampade slänten där barnen hade åkt kälke, slängde sig på mage och for ner för den i en enda lång, mjuk glidning med simfötterna bakåt. Längst ner ställde hon sig upp, skakade på sig och tittade tillbaka på mig för att se om jag hade tittat. Det hade jag. Jag tog mig ner efter henne på det långsamma sättet, på benen.</w:t>
+        <w:t xml:space="preserve">Vid krigsmonumentet sprang Pip i förväg till den tilltrampade slänten där barnen hade åkt kälke, slängde sig på mage och for ner för den i en enda lång, mjuk glidning med vingarna bakåt. Längst ner ställde hon sig upp, skakade på sig och tittade tillbaka på mig för att se om jag hade tittat. Det hade jag. Jag tog mig ner efter henne på det långsamma sättet, på benen.</w:t>
       </w:r>
     </w:p>
     <w:p>
@@ -5581,7 +5581,7 @@
     </w:p>
     <w:p>
       <w:r>
-        <w:t>Vi var ett dussin där framåt förmiddagen, och det kändes som en vakstuga där den döde ännu inte var kall. Hal stod i arkivrummet med sitt linjerade papper slappt i handen. Han tittade på den låga hyllan där skattelängderna hade legat, kyrkoprotokollen under dem, det bruna vattnet som stod en halv centimeter över golvbrädorna och sög sig upp i kartongerna underifrån. En hård förmiddags skada, inte en ruin. Men nog så illa. Lukten av vått, gammalt papper hängde i rummet, sötaktig och slutgiltig. Lukten av något som inte gick att ställa till rätta exakt, hur försiktiga händer man än hade. Pip, den enda varelse på plats som gladdes åt stående vatten, fick lyftas ut därifrån innan hon började vada runt bland kartongerna.</w:t>
+        <w:t xml:space="preserve">Vi var ett dussin där framåt förmiddagen, och det kändes som en likvaka där den döde ännu inte var kall. Hal stod i arkivrummet med sitt linjerade papper slappt i handen. Han tittade på den låga hyllan där skattelängderna hade legat, kyrkoprotokollen under dem, det bruna vattnet som stod en halv centimeter över golvbrädorna och sög sig upp i kartongerna underifrån. En hård förmiddags skada, inte en ruin. Men nog så illa. Lukten av vått, gammalt papper hängde i rummet, sötaktig och slutgiltig. Lukten av något som inte gick att ställa till rätta exakt, hur försiktiga händer man än hade. Pip, den enda varelse på plats som gladdes åt stående vatten, fick lyftas ut därifrån innan hon började vada runt bland kartongerna.</w:t>
       </w:r>
     </w:p>
     <w:p>
@@ -5646,7 +5646,7 @@
     </w:p>
     <w:p>
       <w:r>
-        <w:t>Och på hörnet av det torra bordet, bortom det blöta, låg hans klocka.</w:t>
+        <w:t xml:space="preserve">Och på hörnet av det torra bordet, undan det blöta, låg hans klocka.</w:t>
       </w:r>
     </w:p>
     <w:p/>
@@ -5853,7 +5853,7 @@
     </w:p>
     <w:p>
       <w:r>
-        <w:t>"Jag fäste ingen vikt vid det alls. En förare som stannat för att ta en tupplur. Men Pete känner till varenda lastbil som kör in på den gården, och han sa att det inte var kötthandlarens, och jag hörde inte någons." Jag flyttade fingret upp längs skeden mot pepparn. "Och Dannys gestalt. Smal och snabb, vid Gretas tröskel innan ugnarna tändes, och på väg upp mot bortre änden. Jag fick höra talas om guldbutiken. Han sa aldrig att den gick in på Sugarplum. Han sa den bortre änden. Jag placerade butiken där själv."</w:t>
+        <w:t xml:space="preserve">"Jag fäste ingen vikt vid det alls. En förare som stannat för att ta en tupplur. Men Pete känner till varenda lastbil som kör in på den gården, och han sa att det inte var kötthandlarens, och jag hörde inte någons." Jag flyttade fingret upp längs skeden mot pepparn. "Och Dannys gestalt. Smal och snabb, vid Gretas tröskel innan ugnarna tändes, och på väg upp mot bortre änden. Jag hörde guldbutiken i det han sa. Han sa aldrig att den gick in på Sugarplum. Han sa den bortre änden. Jag placerade butiken där själv."</w:t>
       </w:r>
     </w:p>
     <w:p>
@@ -5943,7 +5943,7 @@
     </w:p>
     <w:p>
       <w:r>
-        <w:t>"Det var vad jag trodde. Sedan gick Doc igenom hennes förråd i torsdags och det fanns inget syrningsmedel där, och hon berättade för mig vem som hade pratat med henne om Gretas fogar." Jag gick inte längre än så, eftersom jag hade svurit på att lämna ansikten därhän för natten. "Så jag står kvar med papperet. Ett flygblad är ett korrektur på någons disk långt innan det blir ett flygblad på en anslagstavla. Någon såg det där. Någon läste ut den veckan ur det och skrev ett klagomål till länet för att få in det i tid."</w:t>
+        <w:t xml:space="preserve">"Det var vad jag trodde. Sedan gick Doc igenom hennes förråd i torsdags och det fanns inget syrningsmedel där, och hon berättade för mig vem som hade pratat med henne om Gretas fogar." Jag gick inte längre än så, eftersom jag hade svurit på att lämna ansikten därhän för natten. "Så jag står kvar med papperet. Ett flygblad är ett korrektur på någons disk långt innan det blir ett flygblad på en anslagstavla. Någon såg det där. Någon läste ut den veckan ur det och skrev ett klagomål till länet som skulle landa just den veckan."</w:t>
       </w:r>
     </w:p>
     <w:p>
@@ -5963,7 +5963,7 @@
     </w:p>
     <w:p>
       <w:r>
-        <w:t>"Vem mer såg det där flygbladet i tid?"</w:t>
+        <w:t xml:space="preserve">"Vem mer såg det där flygbladet i förväg?"</w:t>
       </w:r>
     </w:p>
     <w:p>
@@ -6274,7 +6274,7 @@
     <w:p/>
     <w:p>
       <w:r>
-        <w:t>"Det är kylrummet. Det har alltid varit kylrummet, för Harold, för leveranskillarna, för alla som någonsin har jobbat för mig. Joyce kallade det för kallrummet. Hon brukade säga: Jag går in i kallrummet, Greta, se till att frallorna inte bränns vid, som om det vore ett rum i ett hus. Och handfatet vid bakdörren. Den gamla Hobart-blandaren stod bredvid den i flera år, tills motorn la av, så hon kallade den för Hobart-diskhon, och det bet sig fast hos henne och inte hos någon annan."</w:t>
+        <w:t xml:space="preserve">"Det är kylrummet. Det har alltid varit kylrummet, för Harold, för leveranskillarna, för alla som någonsin har jobbat för mig. Joyce kallade det för kallrummet. Hon brukade säga: Jag går in i kallrummet, Greta, se till att frallorna inte bränns vid, som om det vore ett rum i ett hus. Och handfatet vid bakdörren. Den gamla Hobart-blandaren stod bredvid det i flera år, tills motorn la av, så hon kallade det för Hobart-diskhon, och det bet sig fast hos henne och inte hos någon annan."</w:t>
       </w:r>
     </w:p>
     <w:p/>
@@ -6340,7 +6340,7 @@
     <w:p/>
     <w:p>
       <w:r>
-        <w:t>"En sitter på min ring. Den andra satt på Joyces. Hon lade sin butiksnyckel på den här disken den dagen hon slutade, och jag tänkte aldrig på grindnyckeln. Det är samma lås som har suttit på den grinden sedan Harold hängde upp den. Jag har aldrig bytt det."</w:t>
+        <w:t xml:space="preserve">"En sitter på min ring. Den andra satt på Joyces. Hon lade sin butiksnyckel på den här disken den dagen hon slutade, och jag tänkte aldrig på grindnyckeln. Det är samma lås som har suttit på den grinden sedan Harold satte dit det. Jag har aldrig bytt det."</w:t>
       </w:r>
     </w:p>
     <w:p/>
@@ -6714,7 +6714,7 @@
     </w:p>
     <w:p>
       <w:r>
-        <w:t>"Varenda ord. Jag svär på skåpbilen. Jag svär inte på en plåt jag inte läste." Han lämnade tillbaka papperet. "Vem tillhör den?"</w:t>
+        <w:t xml:space="preserve">"Varenda ord. Jag svär på skåpbilen. Jag svär inte på en skylt jag inte läste." Han lämnade tillbaka papperet. "Vem tillhör den?"</w:t>
       </w:r>
     </w:p>
     <w:p>
@@ -6792,7 +6792,7 @@
     </w:p>
     <w:p>
       <w:r>
-        <w:t>"Bob Pelkey satt och åt middag med sina barnbarn," sa Tanaka. "Han slog upp det på sin bärbara dator vid köksbordet. Wendt's Bakehouse har haft ett konto hos dem i tjugofem år. En säck av deras syrningsmedel med några veckors mellanrum, till rågbrödet hon bakade åt värdshusen, ända fram till juni. Sedan ingenting. Han säger att hon förlorade sin stora värdshusorder under sommaren, och att rågbrödet försvann med den." En sida vändes i hennes ände. "Sedan en säck den tjugosjunde oktober, levererad till bageriet. Han säger att chaufförens fraktsedel är signerad J. Wendt. Han ska gå in på kontoret först av allt och skicka mig fakturorna och de signerade följesedlarna."</w:t>
+        <w:t xml:space="preserve">"Bob Pelkey satt och åt middag med sina barnbarn," sa Tanaka. "Han slog upp det på sin bärbara dator vid köksbordet. Wendt's Bakehouse har haft ett konto hos dem i tjugofem år. En säck av deras syrningsmedel med några veckors mellanrum, till rågbrödet hon bakade åt värdshusen, ända fram till juni. Sedan ingenting. Han säger att hon förlorade sin stora värdshusorder under sommaren, och att rågbrödet försvann med den." En sida vändes i hennes ände. "Sedan en säck den tjugosjunde oktober, levererad till bageriet. Han säger att chaufförens fraktsedel är signerad J. Wendt. Han ska gå in på kontoret först av allt och skicka mig fakturorna och de signerade fraktsedlarna."</w:t>
       </w:r>
     </w:p>
     <w:p>
@@ -6828,7 +6828,7 @@
     </w:p>
     <w:p>
       <w:r>
-        <w:t>"Natriumdiacetat är ättika, torkad på ett salt," sa han. "Det är den ättika som kom upp i röken när jag brände en nypa i söndags. Och ett salt brinner inte bort. Det fanns mer kvar i skålen än vad vanligt mjöl lämnar efter sig, och jag skrev ner det då." Han plockade ner burken från hyllan ovanför bänken, där den hade stått sedan i torsdags. Han skakade lite på ett rent tefat med några droppar vatten och lade en färsk remsa pH-papper i den. Det blev rött lika snabbt som tidigare.</w:t>
+        <w:t xml:space="preserve">"Natriumdiacetat är ättika, torkad på ett salt," sa han. "Det är den ättika som kom upp i röken när jag brände en nypa i söndags. Och ett salt brinner inte bort. Det fanns mer kvar i skålen än vad vanligt mjöl lämnar efter sig, och jag skrev ner det då." Han plockade ner burken från hyllan ovanför bänken, där den hade stått sedan i torsdags. Han skakade lite på ett rent tefat med några droppar vatten och lade en färsk remsa pH-papper i det. Det blev rött lika snabbt som tidigare.</w:t>
       </w:r>
     </w:p>
     <w:p>
@@ -7324,7 +7324,7 @@
     <w:p/>
     <w:p>
       <w:r>
-        <w:t>"Vad jag än kan göra," sa hon och drog upp dragkedjan på parkasen. "Jag menar det. Jag kom för att hjälpa henne. Jag har försökt hjälpa henne i två veckor, om hon bara hade låtit någon." Hon släppte nycklarna på bordet bredvid påsen, en tung ring av mässing och stål med skåpbilsnyckeln bland dem.</w:t>
+        <w:t xml:space="preserve">"Vad jag än kan göra," sa hon och drog ner dragkedjan på parkasen. "Jag menar det. Jag kom för att hjälpa henne. Jag har försökt hjälpa henne i två veckor, om hon bara hade låtit någon." Hon släppte nycklarna på bordet bredvid påsen, en tung ring av mässing och stål med skåpbilsnyckeln bland dem.</w:t>
       </w:r>
     </w:p>
     <w:p/>
@@ -7354,7 +7354,7 @@
     <w:p/>
     <w:p>
       <w:r>
-        <w:t>"Självklart," sa hon och lutade sig bakåt, uppmärksam, som en kvinna på ett möte hon varit glad att bli bjuden till.</w:t>
+        <w:t xml:space="preserve">"Självklart," sa Joyce och lutade sig bakåt, uppmärksam, som en kvinna på ett möte hon varit glad att bli bjuden till.</w:t>
       </w:r>
     </w:p>
     <w:p/>
@@ -7378,7 +7378,7 @@
     <w:p/>
     <w:p>
       <w:r>
-        <w:t>"Jag svarade min chaufför." Joyce vände sitt leende mot Greta, ångerfullt. "Och vi ringer upp varenda bagerikund vi kan hitta, hjärtat. Det kallas att sälja. Jag är ledsen om det sved."</w:t>
+        <w:t xml:space="preserve">"Jag svarade min chaufför." Joyce vände sitt leende mot Greta, beklagande. "Och vi ringer upp varenda bagerikund vi kan hitta, hjärtat. Det kallas att sälja. Jag är ledsen om det sved."</w:t>
       </w:r>
     </w:p>
     <w:p/>
@@ -7396,7 +7396,7 @@
     <w:p/>
     <w:p>
       <w:r>
-        <w:t>"Doc Mitchell har matchat pulvret i hennes mjöl mot ett syrningsmedel. Pelkey's levererade en säck till dig den tjugosjunde oktober, efter månader utan någon. Du skrev under följesedeln."</w:t>
+        <w:t xml:space="preserve">"Doc Mitchell har matchat pulvret i hennes mjöl mot ett syrningsmedel. Pelkey's levererade en säck till dig den tjugosjunde oktober, efter månader utan någon. Du skrev under fraktsedeln."</w:t>
       </w:r>
     </w:p>
     <w:p/>
@@ -7420,7 +7420,7 @@
     <w:p/>
     <w:p>
       <w:r>
-        <w:t>"Den som kom in kom in genom min gårdsgrind," sa Greta.</w:t>
+        <w:t xml:space="preserve">"Vem det än var så kom den in genom min gårdsgrind," sa Greta.</w:t>
       </w:r>
     </w:p>
     <w:p/>
@@ -7755,7 +7755,7 @@
     </w:p>
     <w:p>
       <w:r>
-        <w:t>"Inte vad han kunde hitta. Ett syrningsmedel är ett livsmedel. Den förstör bara fel deg." Hon stängde anteckningsboken. "Sjukhuset väntar dock inte på någon domstol. Deras kostchef ringde mig så fort jag hade låst upp dörren för att fråga om det var sant. Jag berättade det som är offentligt, åtalspunkterna och ett datum för rättegången, och hon har stoppat leveranserna. Inspektören säger att två värdshus ringde hennes chaufför innan han hade hunnit lasta färdigt skåpbilen. Han såg chauffören bära in brödet igen."</w:t>
+        <w:t xml:space="preserve">"Inte vad han kunde hitta. Ett syrningsmedel är ett livsmedel. Det förstör bara fel deg." Hon stängde anteckningsboken. "Sjukhuset väntar dock inte på någon domstol. Deras kostchef ringde mig så fort jag hade låst upp dörren för att fråga om det var sant. Jag berättade det som är offentligt, åtalspunkterna och ett datum för rättegången, och hon har stoppat leveranserna. Inspektören säger att två värdshus ringde hennes chaufför innan han hade hunnit lasta färdigt skåpbilen. Han såg chauffören bära in brödet igen."</w:t>
       </w:r>
     </w:p>
     <w:p>
@@ -7861,7 +7861,7 @@
     </w:p>
     <w:p>
       <w:r>
-        <w:t>Nick hade fått igång vedkaminen i verkstaden när jag kom hem, och en kanna te stod på bänken bredvid en medar som han höll på att forma. Pip styrde kosan mot eldstaden av fältsten, där ett fat skarpsill väntade på henne, och tog itu med den.</w:t>
+        <w:t xml:space="preserve">Nick hade fått igång vedkaminen i verkstaden när jag kom hem, och en kanna te stod på bänken bredvid en med som han höll på att forma. Pip styrde kosan mot eldstaden av fältsten, där ett fat skarpsill väntade på henne, och tog itu med den.</w:t>
       </w:r>
     </w:p>
     <w:p>
@@ -7901,7 +7901,7 @@
     </w:p>
     <w:p>
       <w:r>
-        <w:t>Nick vände meden i händerna och drog tummen längs dess kurva. "Bjöds det på kaffe den här gången?"</w:t>
+        <w:t xml:space="preserve">Nick vände meden i händerna och drog tummen längs dess kurva. "Bjöd hon på kaffe den här gången?"</w:t>
       </w:r>
     </w:p>
     <w:p>
@@ -8771,7 +8771,7 @@
     </w:p>
     <w:p>
       <w:r>
-        <w:t>Martha fångade in mig på gångvägen ut, med Snowball bökande vid sin vrist och Emma Redfern skuttande ner för farstubron bakom henne, med kinder röda av kyla och spring.</w:t>
+        <w:t xml:space="preserve">Martha fångade in mig på gångvägen ut, med Snowball bökande vid sin vrist och Emma Redfern skuttande nerför verandatrappan bakom henne, med kinder röda av kyla och spring.</w:t>
       </w:r>
     </w:p>
     <w:p>
@@ -8836,12 +8836,12 @@
     </w:p>
     <w:p>
       <w:r>
-        <w:t>Den fanns där under min handflata: den frigjorda, glada magin från tusen jular, dragen en handbredd närmare sin härd. Utanför verkstadsfönstret föll snön stadigt över gården och vägen. Den föll säkert över staden också, över lådorna i Sällskapet och snögubbarna på allmänningen. Nere på Evergreen hade Greta alla sex ugnarna igång mot mörkret.</w:t>
-      </w:r>
-    </w:p>
-    <w:p>
-      <w:r>
-        <w:t>Pip lufsade in från kylan och slängde sig ner på den varma hällstenen med en liten grymtning. Hon sträckte på simfötterna mot värmen som ingen eld skapat, och blundade.</w:t>
+        <w:t xml:space="preserve">Den fanns där under min handflata: den frigjorda, glada magin från tusen jular, dragen en handbredd närmare sin härd. Utanför verkstadsfönstret föll snön stadigt över gården och vägen. Den föll säkert över staden också, över lådorna i Sällskapet och snögubbarna på allmänningen. Nere på Evergreen skulle Greta ha alla sex ugnarna igång mot mörkret.</w:t>
+      </w:r>
+    </w:p>
+    <w:p>
+      <w:r>
+        <w:t xml:space="preserve">Pip lufsade in från kylan och slängde sig ner på den varma hällstenen med en liten grymtning. Hon sträckte ut vingarna mot värmen som ingen eld skapat, och blundade.</w:t>
       </w:r>
     </w:p>
     <w:p>

</xml_diff>

<commit_message>
Full proofcheck Flour Play Swedish: SIGNIFICANT (33 fixes)
Co-Authored-By: Claude Opus 5.5 <noreply@anthropic.com>
Claude-Session: https://claude.ai/code/session_012Cm8JxdqzjuttdUSdkQCUg
</commit_message>
<xml_diff>
--- a/translated/corrected/Flour Play - ASSEMBLED - FORMATTED_Swedish.docx
+++ b/translated/corrected/Flour Play - ASSEMBLED - FORMATTED_Swedish.docx
@@ -132,7 +132,7 @@
     <w:p/>
     <w:p>
       <w:r>
-        <w:t>Staden griper efter de enkla namnen: slaktaren som kedjade fast grinden till lastgården, familjen som låg efter med oljan, en uttråkad grabb med en stulen sprayburk. Jessica sträcker sig efter det som passar – för den som gjorde det här köpte pulvret, kände till dosen och lämnade in ett klagomål som citerade hälsovårdsföreskrifterna ända ner till underparagraf. Det där är inget raseriutbrott. Det är ett yrke.</w:t>
+        <w:t>Staden griper efter de enkla namnen: slaktaren som kedjade fast grinden till lastgården, familjen som ligger efter med oljan, en uttråkad grabb med en stulen sprayburk. Jessica sträcker sig efter det som passar – för den som gjorde det här köpte pulvret, kände till dosen och lämnade in ett klagomål som citerade hälsovårdsföreskrifterna ända ner till underparagraf. Det där är inget raseriutbrott. Det är ett yrke.</w:t>
       </w:r>
     </w:p>
     <w:p/>
@@ -981,7 +981,7 @@
     <w:p/>
     <w:p>
       <w:r>
-        <w:t>"Du har ju redan ett bageri, vet jag. Det där med den…" Hon tvekade och sökte efter rätt ord. "Den lantliga stilen. Bullar och sånt. Jag har hört att hon är en institution." Ännu en tvekan, så lätt att jag kunde ha inbillat mig den. "Stackars människa. Så synd om henne med hennes besvär just nu."</w:t>
+        <w:t>"Ni har ju redan ett bageri, vet jag. Det där med den…" Hon tvekade och sökte efter rätt ord. "Den lantliga stilen. Bullar och sånt. Jag har hört att hon är en institution." Ännu en tvekan, så lätt att jag kunde ha inbillat mig den. "Stackars människa. Så synd om henne med hennes besvär just nu."</w:t>
       </w:r>
     </w:p>
     <w:p/>
@@ -1681,7 +1681,7 @@
     <w:p/>
     <w:p>
       <w:r>
-        <w:t>"Frågan," sa Ivy, och hennes stora skratt fanns inte alls i henne i eftermiddag, "är vem. Vem i den här staden skulle göra något sådant mot Greta? Greta, som gjorde min dotters bröllopstårta och inte ville ha en cent för det."</w:t>
+        <w:t>"Frågan," sa Ivy, och hennes stora skratt fanns inte alls i henne den eftermiddagen, "är vem. Vem i den här staden skulle göra något sådant mot Greta? Greta, som gjorde min dotters bröllopstårta och inte ville ha en cent för det."</w:t>
       </w:r>
     </w:p>
     <w:p/>
@@ -1801,7 +1801,7 @@
     <w:p/>
     <w:p>
       <w:r>
-        <w:t>"Ungar," höll Olivia med, och en allmän lättelse spred sig i cirkeln, befrielsen av ett namn som inte sårade någon. "Färgen i alla fall. Det ser ut som ungar i mitt tycke. En uttråkad grabb med en stulen burk, några stora, fula ord och så springa innan någon ser dem. Det var så staketet vid bollplanen råkade ut för för två somrar sedan, om ni minns. Det var Petersen-pojken och en kompis. Lite skrämsel, en skrubbning och ett samtal med deras fäder satte stopp för det där."</w:t>
+        <w:t>"Ungar," höll Olivia med, och en allmän lättelse spred sig i cirkeln, befrielsen av ett namn som inte sårade någon. "Färgen i alla fall. Det ser ut som ungar i mitt tycke. En uttråkad grabb med en stulen burk, några stora, fula ord och så springa innan någon ser dem. Det var så staketet vid bollplanen blev nerklottrat för två somrar sedan, om ni minns. Det var Petersen-pojken och en kompis. Lite skrämsel, en skrubbning och ett samtal med deras fäder satte stopp för det där."</w:t>
       </w:r>
     </w:p>
     <w:p/>
@@ -2010,7 +2010,7 @@
     <w:p/>
     <w:p>
       <w:r>
-        <w:t>Den första vintern klarade vi oss nätt och jämnt. Snö upp till takfoten i december och kvarnen ännu inte rest. Det var delandet som räddade oss. Ingen mans vedbod var hans egen det året, ingen kvinnas skafferi. Vi lade allt gemensamt och klarade oss till våren med varje själ av oss i livet. Låt det bli antecknat att Frost Falls inte byggdes av de starka. Det byggdes av grannsämja. — E. Frost, hennes hand, 1809.</w:t>
+        <w:t>Den första vintern klarade vi oss nätt och jämnt. Snö upp till takfoten i december och kvarnen ännu inte rest. Det var delandet som räddade oss. Ingen mans vedtrave var hans egen det året, ingen kvinnas skafferi. Vi lade allt gemensamt och klarade oss till våren med varje själ av oss i livet. Låt det bli antecknat att Frost Falls inte byggdes av de starka. Det byggdes av grannsämja. — E. Frost, hennes hand, 1809.</w:t>
       </w:r>
     </w:p>
     <w:p/>
@@ -2133,7 +2133,7 @@
     <w:p/>
     <w:p>
       <w:r>
-        <w:t xml:space="preserve">Claire kände till det vid middagstid. Två dagar senare fanns ett fotografi av teckningen i Gazette, båda sidor, de stela blyertstecknade grundarna och den fina bruna handstilen. Rubriken löd EN GRUNDARES EGNA ORD, och under den, med mindre stil: </w:t>
+        <w:t xml:space="preserve">Claire kände till det till kvällsmaten. Två dagar senare fanns ett fotografi av teckningen i Gazette, båda sidor, de stela blyertstecknade grundarna och den fina bruna handstilen. Rubriken löd EN GRUNDARES EGNA ORD, och under den, med mindre stil: </w:t>
       </w:r>
       <w:r>
         <w:rPr>
@@ -2175,7 +2175,7 @@
     <w:p/>
     <w:p>
       <w:r>
-        <w:t>Jag tänkte på Theo som satt böjd över sina stift i det kalla främre rummet och lappade ihop en byggnad bit för bit som inte kunde lagas för kärleks skull, enbart för pengar. Och på Eliza Frost, som skrivit att ingen mans vedbod var hans egen det året.</w:t>
+        <w:t>Jag tänkte på Theo som satt böjd över sina stift i det kalla främre rummet och lappade ihop en byggnad bit för bit som inte kunde lagas för kärleks skull, enbart för pengar. Och på Eliza Frost, som skrivit att ingen mans vedtrave var hans egen det året.</w:t>
       </w:r>
     </w:p>
     <w:p/>
@@ -2342,7 +2342,7 @@
     <w:p/>
     <w:p>
       <w:r>
-        <w:t>"Jag ska säga dig en sak," sa han, lägre nu, med förbittringen borta ur rösten, "och du kan göra vad du vill med det, för jag kan inte göra mycket med det själv. De morgnar jag är nere på gården i mörkret har jag inte varit den enda där." Han vände på huvudet mot sitt främre fönster och butiksfasaderna vid Evergreen tvärs över allmänningen, med gården utom synhåll bakom dem. "Det har varit någon runt baksidan av hennes hus. Tidigt, innan det är tillräckligt ljust för att se ett ansikte, bara en gestalt, och som försvinner snabbt när mitt helljus kommer runt hörnet. Två gånger har jag sett det. Kanske tre. Någon där ingen borde vara vid den tiden, tätt intill hennes bakdörr, och sedan borta." Han rynkade pannan ner mot sina händer. "Jag trodde det var en luffare först, någon som var ute efter värmen från hennes ventilationsgaller. Men en luffare slår sig till ro, och den här gjorde inte det. Den här höll på med något. Och drog när den blev sedd. En av de morgnarna stod det en skåpbil jag inte kände igen, parkerad längst bort vid apoteket med släckta lyktor. Inte köttbilens. Utomlänsplåt; jag hann inte läsa den."</w:t>
+        <w:t>"Jag ska säga dig en sak," sa han, lägre nu, med förbittringen borta ur rösten, "och du kan göra vad du vill med det, för jag kan inte göra mycket med det själv. De morgnar jag är nere på gården i mörkret har jag inte varit den enda där." Han vände på huvudet mot sitt främre fönster och butiksfasaderna vid Evergreen tvärs över allmänningen, med gården utom synhåll bakom dem. "Det har varit någon runt baksidan av hennes hus. Tidigt, innan det är tillräckligt ljust för att se ett ansikte, bara en gestalt, och som försvinner snabbt när mitt helljus kommer runt hörnet. Två gånger har jag sett det. Kanske tre. Någon där ingen borde vara vid den tiden, tätt intill hennes bakdörr, och sedan borta." Han rynkade pannan ner mot sina händer. "Jag trodde det var en luffare först, någon som var ute efter värmen från hennes ventilationsgaller. Men en luffare slår sig till ro, och den här gjorde inte det. Den här höll på med något. Och drog när den blev sedd. En av de morgnarna stod det en skåpbil jag inte kände igen, parkerad längst bort vid apoteket med släckta lyktor. Inte köttbilens. Utomlänsskylt; jag hann inte läsa den."</w:t>
       </w:r>
     </w:p>
     <w:p/>
@@ -2597,7 +2597,7 @@
     <w:p/>
     <w:p>
       <w:r>
-        <w:t>Nick var i verkstaden. Jag kände det på lukten redan innan jag såg skenet, trärök och tallkåda och het järn. Och under allt det låg den där andra doften som rummet hade burit på i veckor, likt en struken tändsticka, nyhuggen ceder och någonting varmt som man inte kunde sätta ett namn på. Han kom till dörren medan han torkade händerna, kastade en blick på mitt ansikte och frågade inte vad som stod på. Han frågade:</w:t>
+        <w:t>Nick var i verkstaden. Jag kände det på lukten redan innan jag såg skenet, trärök och tallkåda och hett järn. Och under allt det låg den där andra doften som rummet hade burit på i veckor, likt en struken tändsticka, nyhuggen ceder och någonting varmt som man inte kunde sätta ett namn på. Han kom till dörren medan han torkade händerna, kastade en blick på mitt ansikte och frågade inte vad som stod på. Han frågade:</w:t>
       </w:r>
     </w:p>
     <w:p>
@@ -2620,7 +2620,7 @@
     <w:p/>
     <w:p>
       <w:r>
-        <w:t>Jag ställde mig vid den. Den stora eldstaden av runda fältstenar spred sitt mjuka guldsken över det kalla, tomma gallret, och ovanför gallret hängde magin i lösa guldtrådar, lägre än jag mindes och tjockare. Den var varm. Inte med vedspisens hetta, som var dämpad lågt tvärs över rummet. Varm inifrån, som en sten som har suttit hela dagen i solen. Dess värme sträckte sig mot mig, och förbi mig, mot dörren. Pip gick rakt fram till gallret och stod med näbben uppåtriktad, och följde guldtrådarna så som hon skulle ha följt en sill över en tallrik.</w:t>
+        <w:t>Jag ställde mig vid den. Den stora eldstaden av runda fältstenar spred sitt mjuka guldsken över det kalla, tomma gallret, och ovanför gallret hängde magin i lösa guldtrådar, lägre än jag mindes och tjockare. Den var varm. Inte med vedspisens hetta, som var dämpad lågt tvärs över rummet. Varm inifrån, som en sten som har legat hela dagen i solen. Dess värme sträckte sig mot mig, och förbi mig, mot dörren. Pip gick rakt fram till gallret och stod med näbben uppåtriktad, och följde guldtrådarna så som hon skulle ha följt en sill över en tallrik.</w:t>
       </w:r>
     </w:p>
     <w:p/>
@@ -2839,7 +2839,7 @@
     <w:p/>
     <w:p>
       <w:r>
-        <w:t xml:space="preserve">"Det räcker till ett interimistiskt beslut," sa han, och jag såg hur Greta inte kände till ordet och lärde sig det i nästa andetag. "Jag måste dra in tillståndet i avvaktan på rättelse. Du har stängt för försäljning tills de här punkterna har åtgärdats och jag kommer tillbaka och godkänner dem. Så fort jag kan, men med de anmärkta punkterna som grund."</w:t>
+        <w:t xml:space="preserve">"Det räcker till ett interimistiskt beslut," sa han, och jag såg hur Greta inte kände till ordet och lärde sig det i nästa andetag. "Jag måste dra in tillståndet i avvaktan på rättelse. Du måste hålla stängt för försäljning tills de här punkterna har åtgärdats och jag kommer tillbaka och godkänner dem. Så fort jag kan, men med de anmärkta punkterna som grund."</w:t>
       </w:r>
     </w:p>
     <w:p/>
@@ -3128,7 +3128,7 @@
     </w:p>
     <w:p>
       <w:r>
-        <w:t>Namnet nådde mig snett underifrån. Från någon som inte menade att bli tjuvlyssnad på, och som skulle ha skämts om de blivit det. Jag befann mig i Frosty's nästa morgon och fyllde en påse med det mjöl som Hal höll åt folk vars spisar stod kalla, medan Pip stod framför de konserverade sardinerna i tyst bön. Jag hade tänkt baka Gretas shortbread igen i mitt kök till tunnan. Två kvinnor vid konserverna stack huvudena ihop över oljepriset. Den ena sa ett namn jag inte kände till. Den andra sa: "Ja, de ligger så långt efter i år, och desperata människor gör desperata saker." Den första sa: "Jag säger inget." De drog sig vidare längs gången mot soppan, sin lilla elakhet undanstoppad utom synhåll. Utan att veta att de hade tappat den. Utan att veta att jag hade plockat upp den.</w:t>
+        <w:t>Namnet nådde mig snett underifrån. Från någon som inte menade att bli tjuvlyssnad på, och som skulle ha skämts om de blivit det. Jag befann mig i Frosty's nästa morgon och fyllde en påse med det mjöl som Hal höll åt folk vars spisar stod kalla, medan Pip stod framför de konserverade sardinerna i tyst bön. Jag hade tänkt baka Gretas småkakor igen i mitt kök till tunnan. Två kvinnor vid konserverna stack huvudena ihop över oljepriset. Den ena sa ett namn jag inte kände till. Den andra sa: "Ja, de ligger så långt efter i år, och desperata människor gör desperata saker." Den första sa: "Jag säger inget." De drog sig vidare längs gången mot soppan, sin lilla elakhet undanstoppad utom synhåll. Utan att veta att de hade tappat den. Utan att veta att jag hade plockat upp den.</w:t>
       </w:r>
     </w:p>
     <w:p>
@@ -4216,7 +4216,7 @@
     <w:p/>
     <w:p>
       <w:r>
-        <w:t>Väggen var ett eko. Snacket om Holly Jolly Bakery hade gått fram och tillbaka längs gatan, och någon ung person hade gripit efter närmaste sätt att delta. Det kom efter nyheterna. Det hopade sig ovanpå ett problem som någon annan hade startat.</w:t>
+        <w:t>Väggen var ett eko. Snacket om Holly Jolly Bakery hade gått fram och tillbaka längs gatan, och någon ung person hade gripit efter närmaste sätt att delta. Det kom efter att nyheten spridits. Det hopade sig ovanpå ett problem som någon annan hade startat.</w:t>
       </w:r>
     </w:p>
     <w:p/>
@@ -4622,7 +4622,7 @@
     </w:p>
     <w:p>
       <w:r>
-        <w:t>Hon behövde inte säga vem. Greta hade inte kommit. Hennes butik var stängd och hennes ugnar kalla, och hon hade sagt till mig i morse att hon inte stod ut med att vara i en hall full av människor som tyckte synd om henne. Jag hade inte sagt emot.</w:t>
+        <w:t>Hon behövde inte säga vem. Greta hade inte kommit. Hennes butik var stängd och hennes ugnar kalla, och hon hade sagt till mig den morgonen att hon inte stod ut med att vara i en hall full av människor som tyckte synd om henne. Jag hade inte sagt emot.</w:t>
       </w:r>
     </w:p>
     <w:p>
@@ -4676,7 +4676,7 @@
     </w:p>
     <w:p>
       <w:r>
-        <w:t>Den gamla lådan låg kvar där den var, förseglad under sitt kort i Sällskapets främre rum till dess timme var slagen. Alla hade dragit en tydlig gräns i sina sinnen mellan de två, utan att en enda själ behövde säga det högt. Den gamla skulle öppnas vid det nya året, i gemenskap, som förfäderna hade avsett. Den nya skulle fyllas nu, av levande händer, och begravas oöppnad i ytterligare hundra år. Den ena väntade man på. Den andra lade man till i. När jag såg mina grannar lägga sina små skatter i den nya kapseln medan tunnor med burkar och bröd rullade förbi till husen uppe i backen, tyckte jag att jag aldrig hade sett Frost Falls mer fullständigt sig självt.</w:t>
+        <w:t>Den gamla lådan låg kvar där den var, förseglad under sitt kort i Sällskapets främre rum till dess timme var slagen. Alla hade dragit en tydlig gräns i sina sinnen mellan de två, utan att en enda själ behövde säga det högt. Den gamla skulle öppnas vid det nya året, i sällskap, som förfäderna hade avsett. Den nya skulle fyllas nu, av levande händer, och begravas oöppnad i ytterligare hundra år. Den ena väntade man på. Den andra lade man till i. När jag såg mina grannar lägga sina små skatter i den nya kapseln medan tunnor med burkar och bröd rullade förbi till husen uppe i backen, tyckte jag att jag aldrig hade sett Frost Falls mer fullständigt sig självt.</w:t>
       </w:r>
     </w:p>
     <w:p>
@@ -4836,7 +4836,7 @@
         <w:t>Torkad syra. Någon lade det där. Och den som gjorde det visste exakt hur mycket som skulle i.</w:t>
       </w:r>
       <w:r>
-        <w:t xml:space="preserve"> En syra, hade hon sagt, lätt som en plätt, till en ring av kvinnor vid ett matfat. Ett pulver som blandats in i hennes mjöl efter hennes beställning av en leverantör som stoppade i vad hon än bad om. En kvinna som visste på grammet hur mycket en deg tålde, och därmed visste hur mycket som skulle förstöra den.</w:t>
+        <w:t xml:space="preserve"> En syra, hade hon sagt, lätt som en plätt, till en ring av kvinnor vid en mattunna. Ett pulver som blandats in i hennes mjöl efter hennes beställning av en leverantör som stoppade i vad hon än bad om. En kvinna som visste på grammet hur mycket en deg tålde, och därmed visste hur mycket som skulle förstöra den.</w:t>
       </w:r>
     </w:p>
     <w:p>
@@ -4961,7 +4961,7 @@
     </w:p>
     <w:p>
       <w:r>
-        <w:t>"Du har inte skådat en december på den här gatan som den som kommer," sa hon ledigt och ställde koppen framför mig. "Jag har gått igenom statistiken. Befolkningen, kyrkkaffet, skolan, hela julkalendern som ni för. Det är mer söt handel i den här staden vid jul än den någonsin haft någonstans att göra av med, eftersom den bara har haft det enda gamla bageriet att handla i. Till landsortspriser. På landsortsvaror." Hon sa "det enda gamla bageriet" trevligt, som om hon nämnde något som redan hörde det förflutna till. "Hela den handeln letar någonstans att ta vägen. Och här är jag."</w:t>
+        <w:t>"Du har inte skådat en december på den här gatan som den som kommer," sa hon ledigt och ställde koppen framför mig. "Jag har gått igenom statistiken. Befolkningen, kyrkmiddagarna, skolan, hela julkalendern som ni för. Det finns mer handel med sötsaker i den här staden vid jul än den någonsin haft någonstans att göra av med, eftersom den bara har haft det enda gamla bageriet att handla i. Till landsortspriser. På landsortsvaror." Hon sa "det enda gamla bageriet" trevligt, som om hon nämnde något som redan hörde det förflutna till. "Hela den handeln letar någonstans att ta vägen. Och här är jag."</w:t>
       </w:r>
     </w:p>
     <w:p>
@@ -5021,7 +5021,7 @@
     </w:p>
     <w:p>
       <w:r>
-        <w:t>Och de skulle ha haft rätt, med tanke på bevisen. Att känna till fogarna var inte att hälla ut pulvret. Hon hade gett mig ett erkännande och ingenting alls att göra av det, och jag trodde att hon under medkänslan visste exakt hur lite jag kunde bära med mig ut ur hennes butik.</w:t>
+        <w:t>Och de skulle ha haft rätt, med tanke på bevisen. Att känna till fogarna var inte att hälla ut pulvret. Hon hade låtit mig känna igen det och gett mig ingenting alls att göra av det, och jag trodde att hon under medkänslan visste exakt hur lite jag kunde bära med mig ut ur hennes butik.</w:t>
       </w:r>
     </w:p>
     <w:p>
@@ -5051,7 +5051,7 @@
     </w:p>
     <w:p>
       <w:r>
-        <w:t>Jag hade gått in för att läsa av henne. Jag hade läst av henne. Alldeles för glad över Gretas fall, och alldeles för väl förtrogen med dess exakta form. Under tjusningen fanns glimten av en kvinna som redan hade tillbringat en säsong som ännu inte hade kommit. Jag kände henne nu. Jag hade kunnat svära på det. Men jag skulle behöva något med hennes namn på, något som en krans och en kaffe inte kunde tvätta bort.</w:t>
+        <w:t>Jag hade gått in för att läsa av henne. Jag hade läst av henne. Alldeles för glad över Gretas fall, och alldeles för väl förtrogen med dess exakta form. Under tjusningen fanns glimten av en kvinna som redan hade räknat hem en säsong som ännu inte hade kommit. Jag kände henne nu. Jag hade kunnat svära på det. Men jag skulle behöva något med hennes namn på, något som en krans och en kaffe inte kunde tvätta bort.</w:t>
       </w:r>
     </w:p>
     <w:p>
@@ -5773,12 +5773,12 @@
     </w:p>
     <w:p>
       <w:r>
-        <w:t>"Så det är hennes," sa Nick.</w:t>
-      </w:r>
-    </w:p>
-    <w:p>
-      <w:r>
-        <w:t>"Det kom ur hennes vägg. Det är allt jag kan svära på." Jag lade ett finger på skeden, där gränden gick bakom affärerna. "Den där containern står öppen i en allmän gränd. Inget lock, inget lås. Pete går förbi den. Buden backar upp till den. Ett barn skulle kunna lyfta ur en tegelsten. Jag såg hennes bråte på den stenen och läste hennes namn. Vänd på det. Om du ville att staden skulle titta åt Sugarplum, vart skulle du gå för att hitta en tegelsten?"</w:t>
+        <w:t>"Så den är hennes," sa Nick.</w:t>
+      </w:r>
+    </w:p>
+    <w:p>
+      <w:r>
+        <w:t>"Den kom ur hennes vägg. Det är allt jag kan svära på." Jag lade ett finger på skeden, där gränden gick bakom affärerna. "Den där containern står öppen i en allmän gränd. Inget lock, inget lås. Pete går förbi den. Buden backar upp till den. Ett barn skulle kunna lyfta ur en tegelsten. Jag såg hennes bråte på den stenen och läste hennes namn. Vänd på det. Om du ville att staden skulle titta åt Sugarplum, vart skulle du gå för att hitta en tegelsten?"</w:t>
       </w:r>
     </w:p>
     <w:p>
@@ -6004,7 +6004,7 @@
     <w:p/>
     <w:p>
       <w:r>
-        <w:t>"En kvinna ringde mig i går kväll, vid middagstid. Trevlig. Affärsmässig. Hon sa att hon ringde från Wendt's Bakehouse borta i Bridgton, och att eftersom Holly Jolly var stängt skulle de mer än gärna fylla min Holly Jolly-beställning. Två chokladpekannötspajer och ett dussin frallor, redo onsdagen före tacksägelsedagen."</w:t>
+        <w:t>"En kvinna ringde mig i går kväll, vid kvällsmaten. Trevlig. Affärsmässig. Hon sa att hon ringde från Wendt's Bakehouse borta i Bridgton, och att eftersom Holly Jolly var stängt skulle de mer än gärna fylla min Holly Jolly-beställning. Två chokladpekannötspajer och ett dussin frallor, redo onsdagen före tacksägelsedagen."</w:t>
       </w:r>
     </w:p>
     <w:p/>
@@ -6058,7 +6058,7 @@
     <w:p/>
     <w:p>
       <w:r>
-        <w:t>"Och hon hade ringt oss själv," sa Martha. "Hon ringde mig i oktober för att försäkra sig om att jag ville ha frallorna och inte limpan. Hon lämnar inte ifrån sig sina kunder till vem som helst."</w:t>
+        <w:t>"Och hon hade ringt oss själv," sa Martha. "Hon ringde mig i oktober för att försäkra sig om att jag ville ha frallorna och inte limpan. Hon lämnar inte ifrån sig sina kunder till någon."</w:t>
       </w:r>
     </w:p>
     <w:p/>
@@ -6924,7 +6924,7 @@
     </w:p>
     <w:p>
       <w:r>
-        <w:t>Noriko Tanaka hade en bra eld tänd i sitt lilla kontor på stationen, och en vattenkokare med en buckla på sidan stod tyst på den. Hon hade sagt att hon skulle vara inne, söndag eller ej, och det var hon. Hon reste sig när jag kom in. Pip gick rakt fram till spisen och stannade tvärt, för det fanns en till fågel i kokarens polerade sida, förvriden av bucklan, och den hade också stannat tvärt.</w:t>
+        <w:t>Noriko Tanaka hade en ordentlig eld i spisen på sitt lilla kontor på stationen, och en vattenkokare med en buckla på sidan stod tyst ovanpå den. Hon hade sagt att hon skulle vara inne, söndag eller ej, och det var hon. Hon reste sig när jag kom in. Pip gick rakt fram till spisen och stannade tvärt, för det fanns en till fågel i kokarens polerade sida, förvriden av bucklan, och den hade också stannat tvärt.</w:t>
       </w:r>
     </w:p>
     <w:p>
@@ -6954,7 +6954,7 @@
     </w:p>
     <w:p>
       <w:r>
-        <w:t>"I anmälan kallades kylrummet för ’kallrummet’ och handfatet för ’Hobart-diskhon’. Greta säger att ingen har kallat det så sedan Joyce. Låset till gårdsgrinden har aldrig bytts ut, och Pete säger att det ständigt går upp. Och det sura upphörde den morgonen Greta började skjuta regeln för bakdörren efter tegelstenen, så den som gjorde det kom in den vägen. Han såg en skåpbil uppe vid apoteket före gryningen, med släckta lyktor, inte köttbilens. Igår tittade han på Claires utskrift av Wendt's skåpbil och sa: ’Det är den.’"</w:t>
+        <w:t>"I anmälan kallades kylrummet för ’kallrummet’ och handfatet för ’Hobart-diskhon’. Greta säger att ingen har kallat det så sedan Joyce. Låset till gårdsgrinden har aldrig bytts ut, och Pete säger att det ständigt går upp. Och det sura upphörde den morgonen Greta började skjuta regeln för bakdörren efter tegelstenen, så den som gjorde det kom in den vägen. Pete såg en skåpbil uppe vid apoteket före gryningen, med släckta lyktor, inte köttbilens. Igår tittade han på Claires utskrift av Wendt's skåpbil och sa: ’Det är den.’"</w:t>
       </w:r>
     </w:p>
     <w:p>
@@ -8033,12 +8033,12 @@
     </w:p>
     <w:p>
       <w:r>
-        <w:t>Greta hörde dem till slut. Sedan gav hon dem varsin kakaobulle.</w:t>
-      </w:r>
-    </w:p>
-    <w:p>
-      <w:r>
-        <w:t>"Ni kan skotta min farstukvist till jul," sa hon. "Med början i morgon, före skolan."</w:t>
+        <w:t>Greta lät dem tala till punkt. Sedan gav hon dem varsin kakaobulle.</w:t>
+      </w:r>
+    </w:p>
+    <w:p>
+      <w:r>
+        <w:t>"Ni kan skotta min trappa till jul," sa hon. "Med början i morgon, före skolan."</w:t>
       </w:r>
     </w:p>
     <w:p>
@@ -8070,7 +8070,7 @@
     </w:p>
     <w:p>
       <w:r>
-        <w:t>Hon drog med mig bakom disken när kön glesnade, in till värmen längst bak där ugnarna knäppte, och visade mig kassan. Den gick inte att stänga.</w:t>
+        <w:t>Hon drog med mig bakom disken när kön glesnade, in till värmen längst bak där ugnarna knäppte, och visade mig kassalådan. Den gick inte att stänga.</w:t>
       </w:r>
     </w:p>
     <w:p>
@@ -8448,7 +8448,7 @@
     <w:p/>
     <w:p>
       <w:r>
-        <w:t>Dosan fylldes långsamt, med en enkel sak i taget.</w:t>
+        <w:t>Lådan fylldes långsamt, med en enkel sak i taget.</w:t>
       </w:r>
     </w:p>
     <w:p/>
@@ -8460,7 +8460,7 @@
     <w:p/>
     <w:p>
       <w:r>
-        <w:t>Hon hade en vante. Bara en. En röd, från någon vinter innan jag hann lära känna henne, stickad för en hand som var två år mindre än den hand hon hade vuxit ifrån. Dess make var sedan länge borta.</w:t>
+        <w:t>Hon hade en vante. Bara en. En röd, från någon vinter innan jag hann lära känna henne, stickad för en hand som var två år mindre än den hand hon hade nu. Dess make var sedan länge borta.</w:t>
       </w:r>
     </w:p>
     <w:p/>
@@ -8532,7 +8532,7 @@
     <w:p/>
     <w:p>
       <w:r>
-        <w:t>"Inte den," sa jag till henne över stadens förtjusning, och la tillbaka fisken i fickan. "Ingen vill ha en hundraårig sardin, din skamlösa fågel." Hon sjönk mot min arm med den missförstådda, skamfilade värdigheten. Rummet skrattade, Emma hårdast av alla, och Pip bar det.</w:t>
+        <w:t>"Inte den," sa jag till henne över stadens förtjusning, och la tillbaka fisken i fickan. "Ingen vill ha en hundraårig sardin, din skamlösa fågel." Hon sjönk mot min arm med de missförståddas kränkta värdighet. Rummet skrattade, Emma hårdast av alla, och Pip bar det.</w:t>
       </w:r>
     </w:p>
     <w:p/>
@@ -8756,7 +8756,7 @@
     </w:p>
     <w:p>
       <w:r>
-        <w:t>Lådorna stod sida vid sida i det främre rummets glasmonter i det grå ljuset. Den nya, cederlådan med locket stängt och sitt nya kort, rymde ullen, biljetten, de röda vantarna och allt det andra. Ett mynt hade blivit tyst varmt bland dem som bara Nick och jag någonsin skulle räkna med.</w:t>
+        <w:t>Lådorna stod sida vid sida i det främre rummets glasmonter i det grå ljuset. Den nya, cederlådan med locket stängt och sitt nya kort, rymde ullen, biljetten, de röda vantarna och allt det andra. Ett mynt hade blivit tyst varmt bland dem som bara Nick och jag någonsin skulle kunna förklara.</w:t>
       </w:r>
     </w:p>
     <w:p>

</xml_diff>